<commit_message>
Dodao PDF-ove da bi se lakše čitalo preko browsera
</commit_message>
<xml_diff>
--- a/Specifikacija projekta -frizerski_1.docx
+++ b/Specifikacija projekta -frizerski_1.docx
@@ -4149,49 +4149,12 @@
       </w:pPr>
       <w:r>
         <w:rPr>
-          <w:color w:val="808080"/>
-        </w:rPr>
-        <w:drawing>
-          <wp:inline distB="114300" distT="114300" distL="114300" distR="114300">
-            <wp:extent cx="5943600" cy="3175000"/>
-            <wp:effectExtent b="0" l="0" r="0" t="0"/>
-            <wp:docPr id="12" name="image2.png"/>
-            <a:graphic>
-              <a:graphicData uri="http://schemas.openxmlformats.org/drawingml/2006/picture">
-                <pic:pic>
-                  <pic:nvPicPr>
-                    <pic:cNvPr id="0" name="image2.png"/>
-                    <pic:cNvPicPr preferRelativeResize="0"/>
-                  </pic:nvPicPr>
-                  <pic:blipFill>
-                    <a:blip r:embed="rId8"/>
-                    <a:srcRect b="0" l="0" r="0" t="0"/>
-                    <a:stretch>
-                      <a:fillRect/>
-                    </a:stretch>
-                  </pic:blipFill>
-                  <pic:spPr>
-                    <a:xfrm>
-                      <a:off x="0" y="0"/>
-                      <a:ext cx="5943600" cy="3175000"/>
-                    </a:xfrm>
-                    <a:prstGeom prst="rect"/>
-                    <a:ln/>
-                  </pic:spPr>
-                </pic:pic>
-              </a:graphicData>
-            </a:graphic>
-          </wp:inline>
-        </w:drawing>
-      </w:r>
-      <w:r>
-        <w:rPr>
           <w:rtl w:val="0"/>
         </w:rPr>
       </w:r>
     </w:p>
     <w:sectPr>
-      <w:headerReference r:id="rId9" w:type="default"/>
+      <w:headerReference r:id="rId8" w:type="default"/>
       <w:pgSz w:h="15840" w:w="12240" w:orient="portrait"/>
       <w:pgMar w:bottom="1440" w:top="1440" w:left="1440" w:right="1440" w:header="720" w:footer="720"/>
       <w:pgNumType w:start="1"/>

</xml_diff>

<commit_message>
Dijagram slucajeva i prepravke
</commit_message>
<xml_diff>
--- a/Specifikacija projekta -frizerski_1.docx
+++ b/Specifikacija projekta -frizerski_1.docx
@@ -1064,7 +1064,32 @@
           <w:vertAlign w:val="baseline"/>
           <w:rtl w:val="0"/>
         </w:rPr>
-        <w:t xml:space="preserve"> Upravljanje uslugama i proizvodima salona</w:t>
+        <w:t xml:space="preserve"> Upravljanje uslugama</w:t>
+      </w:r>
+      <w:r>
+        <w:rPr>
+          <w:rtl w:val="0"/>
+        </w:rPr>
+        <w:t xml:space="preserve">, </w:t>
+      </w:r>
+      <w:r>
+        <w:rPr>
+          <w:rFonts w:ascii="Times New Roman" w:cs="Times New Roman" w:eastAsia="Times New Roman" w:hAnsi="Times New Roman"/>
+          <w:b w:val="0"/>
+          <w:bCs w:val="0"/>
+          <w:i w:val="0"/>
+          <w:iCs w:val="0"/>
+          <w:smallCaps w:val="0"/>
+          <w:strike w:val="0"/>
+          <w:color w:val="000000"/>
+          <w:sz w:val="24"/>
+          <w:szCs w:val="24"/>
+          <w:u w:val="none"/>
+          <w:shd w:fill="auto" w:val="clear"/>
+          <w:vertAlign w:val="baseline"/>
+          <w:rtl w:val="0"/>
+        </w:rPr>
+        <w:t xml:space="preserve">proizvodima i terminima salona</w:t>
       </w:r>
       <w:r>
         <w:rPr>
@@ -1144,7 +1169,7 @@
         <w:rPr>
           <w:rtl w:val="0"/>
         </w:rPr>
-        <w:t xml:space="preserve">Administrator može dodavati nove usluge/proizvode, mijenjati cijene i trajanje postojećih usluga, te brisati nepotrebne usluge/proizvode.</w:t>
+        <w:t xml:space="preserve">Administrator može dodavati nove usluge/proizvode, mijenjati cijene i trajanje (termine) postojećih usluga, te brisati nepotrebne usluge/proizvode.</w:t>
       </w:r>
     </w:p>
     <w:p>
@@ -1231,12 +1256,13 @@
           <w:vertAlign w:val="baseline"/>
           <w:rtl w:val="0"/>
         </w:rPr>
-        <w:t xml:space="preserve"> Upravljanje terminima i rasporedom</w:t>
-      </w:r>
-      <w:r>
-        <w:rPr>
-          <w:rtl w:val="0"/>
-        </w:rPr>
+        <w:t xml:space="preserve"> </w:t>
+      </w:r>
+      <w:r>
+        <w:rPr>
+          <w:rtl w:val="0"/>
+        </w:rPr>
+        <w:t xml:space="preserve">Rezervacija i otkazivanje termina</w:t>
       </w:r>
     </w:p>
     <w:p>
@@ -1311,7 +1337,7 @@
         <w:rPr>
           <w:rtl w:val="0"/>
         </w:rPr>
-        <w:t xml:space="preserve">Sistem omogućava pregled, kreiranje, izmjenu i otkazivanje termina u salonu. Klijent može rezervisati termin, dok frizer i administrator mogu upravljati rasporedom. Sistem osigurava pravilno evidentiranje termina i sprječava njihovo preklapanje.</w:t>
+        <w:t xml:space="preserve">Klijent može rezervisati i otkazati termin, dok frizer može otkazati neki rezervisani termin. Sistem osigurava pravilno evidentiranje termina i sprječava njihovo preklapanje.</w:t>
       </w:r>
     </w:p>
     <w:p>
@@ -1398,12 +1424,13 @@
           <w:vertAlign w:val="baseline"/>
           <w:rtl w:val="0"/>
         </w:rPr>
-        <w:t xml:space="preserve"> Online kupovina proizvoda</w:t>
-      </w:r>
-      <w:r>
-        <w:rPr>
-          <w:rtl w:val="0"/>
-        </w:rPr>
+        <w:t xml:space="preserve"> </w:t>
+      </w:r>
+      <w:r>
+        <w:rPr>
+          <w:rtl w:val="0"/>
+        </w:rPr>
+        <w:t xml:space="preserve">Pregled proizvoda i usluga </w:t>
       </w:r>
     </w:p>
     <w:p>
@@ -1478,12 +1505,37 @@
         <w:rPr>
           <w:rtl w:val="0"/>
         </w:rPr>
-        <w:t xml:space="preserve">Klijent pregledava dostupne proizvode i dodaje željene artikle u košaricu. Nakon odabira, korisnik potvrđuje kupovinu i sistem evidentira narudžbu. Sistem izračunava ukupnu cijenu i prikazuje potvrdu kupovine.</w:t>
+        <w:t xml:space="preserve">Klijent pregledava dostupne proizvode i usluge koje salon nudi.</w:t>
       </w:r>
     </w:p>
     <w:p>
       <w:pPr>
         <w:spacing w:after="200" w:line="192.00000000000003" w:lineRule="auto"/>
+        <w:ind w:firstLine="720"/>
+        <w:rPr/>
+      </w:pPr>
+      <w:r>
+        <w:rPr>
+          <w:rtl w:val="0"/>
+        </w:rPr>
+      </w:r>
+    </w:p>
+    <w:p>
+      <w:pPr>
+        <w:spacing w:after="200" w:line="192.00000000000003" w:lineRule="auto"/>
+        <w:ind w:firstLine="720"/>
+        <w:rPr/>
+      </w:pPr>
+      <w:r>
+        <w:rPr>
+          <w:rtl w:val="0"/>
+        </w:rPr>
+      </w:r>
+    </w:p>
+    <w:p>
+      <w:pPr>
+        <w:spacing w:after="200" w:line="192.00000000000003" w:lineRule="auto"/>
+        <w:ind w:firstLine="720"/>
         <w:rPr/>
       </w:pPr>
       <w:r>
@@ -1947,7 +1999,7 @@
         <w:rPr>
           <w:rtl w:val="0"/>
         </w:rPr>
-        <w:t xml:space="preserve"> Asinhrona operacija</w:t>
+        <w:t xml:space="preserve"> Korištenje vanjskog uređaja</w:t>
       </w:r>
     </w:p>
     <w:p>
@@ -2073,22 +2125,9 @@
       </w:r>
       <w:r>
         <w:rPr>
-          <w:rFonts w:ascii="Times New Roman" w:cs="Times New Roman" w:eastAsia="Times New Roman" w:hAnsi="Times New Roman"/>
-          <w:b w:val="0"/>
-          <w:bCs w:val="0"/>
-          <w:i w:val="0"/>
-          <w:iCs w:val="0"/>
-          <w:smallCaps w:val="0"/>
-          <w:strike w:val="0"/>
-          <w:color w:val="000000"/>
-          <w:sz w:val="24"/>
-          <w:szCs w:val="24"/>
-          <w:u w:val="none"/>
-          <w:shd w:fill="auto" w:val="clear"/>
-          <w:vertAlign w:val="baseline"/>
-          <w:rtl w:val="0"/>
-        </w:rPr>
-        <w:t xml:space="preserve"> Integracija sa mapom lokacija salona</w:t>
+          <w:rtl w:val="0"/>
+        </w:rPr>
+        <w:t xml:space="preserve"> Slanje newslettera za nove dostupne proizvode</w:t>
       </w:r>
       <w:r>
         <w:rPr>
@@ -2114,7 +2153,7 @@
         <w:rPr>
           <w:rtl w:val="0"/>
         </w:rPr>
-        <w:t xml:space="preserve"> Korištenje vanjskog uređaja</w:t>
+        <w:t xml:space="preserve"> Asinhrona operacija</w:t>
       </w:r>
     </w:p>
     <w:p>
@@ -2156,7 +2195,7 @@
         <w:rPr>
           <w:rtl w:val="0"/>
         </w:rPr>
-        <w:t xml:space="preserve">Klijenti mogu pregledati lokacije svih salona putem integrirane mape. Sistem koristi vanjski servis (npr. Google Maps) za prikaz lokacija i navigaciju.</w:t>
+        <w:t xml:space="preserve">Klijenti će dobivati newsletter putem e-maila koji ih obavještava o novim proizvodima i uslugama dostupnim u salonu. Klijent ima pravo izbora da prestane primati newsletter kao i da se ponovno prijavi na isti ukoliko se predomisli. Administrator može urediti sadržaj poruke koju preko newslettera primaju klijenti, kao i vrijeme kada će poruka biti poslata. </w:t>
       </w:r>
       <w:r>
         <w:br w:type="page"/>
@@ -2800,21 +2839,9 @@
             </w:pPr>
             <w:r>
               <w:rPr>
-                <w:rFonts w:ascii="Times New Roman" w:cs="Times New Roman" w:eastAsia="Times New Roman" w:hAnsi="Times New Roman"/>
-                <w:b w:val="0"/>
-                <w:bCs w:val="0"/>
-                <w:i w:val="0"/>
-                <w:iCs w:val="0"/>
-                <w:smallCaps w:val="0"/>
-                <w:strike w:val="0"/>
-                <w:sz w:val="24"/>
-                <w:szCs w:val="24"/>
-                <w:u w:val="none"/>
-                <w:shd w:fill="auto" w:val="clear"/>
-                <w:vertAlign w:val="baseline"/>
                 <w:rtl w:val="0"/>
               </w:rPr>
-              <w:t xml:space="preserve">Upravljanje terminima i rasporedom</w:t>
+              <w:t xml:space="preserve">Rezervacija i otkazivanje termina</w:t>
             </w:r>
             <w:r>
               <w:rPr>
@@ -2888,21 +2915,9 @@
             </w:pPr>
             <w:r>
               <w:rPr>
-                <w:rFonts w:ascii="Times New Roman" w:cs="Times New Roman" w:eastAsia="Times New Roman" w:hAnsi="Times New Roman"/>
-                <w:b w:val="0"/>
-                <w:bCs w:val="0"/>
-                <w:i w:val="0"/>
-                <w:iCs w:val="0"/>
-                <w:smallCaps w:val="0"/>
-                <w:strike w:val="0"/>
-                <w:sz w:val="24"/>
-                <w:szCs w:val="24"/>
-                <w:u w:val="none"/>
-                <w:shd w:fill="auto" w:val="clear"/>
-                <w:vertAlign w:val="baseline"/>
                 <w:rtl w:val="0"/>
               </w:rPr>
-              <w:t xml:space="preserve">Online kupovina proizvoda</w:t>
+              <w:t xml:space="preserve">Pregled proizvoda i usluga</w:t>
             </w:r>
             <w:r>
               <w:rPr>
@@ -2924,7 +2939,7 @@
               <w:rPr>
                 <w:rtl w:val="0"/>
               </w:rPr>
-              <w:t xml:space="preserve">Pregleda proizvode i kupovina</w:t>
+              <w:t xml:space="preserve">Pregleda ponude</w:t>
             </w:r>
           </w:p>
         </w:tc>
@@ -3187,7 +3202,180 @@
           </w:p>
         </w:tc>
       </w:tr>
+      <w:tr>
+        <w:trPr>
+          <w:cantSplit w:val="0"/>
+          <w:trHeight w:val="620" w:hRule="atLeast"/>
+          <w:tblHeader w:val="0"/>
+        </w:trPr>
+        <w:tc>
+          <w:tcPr>
+            <w:vAlign w:val="center"/>
+          </w:tcPr>
+          <w:p>
+            <w:pPr>
+              <w:keepNext w:val="0"/>
+              <w:keepLines w:val="0"/>
+              <w:pageBreakBefore w:val="0"/>
+              <w:widowControl w:val="1"/>
+              <w:pBdr>
+                <w:top w:space="0" w:sz="0" w:val="nil"/>
+                <w:left w:space="0" w:sz="0" w:val="nil"/>
+                <w:bottom w:space="0" w:sz="0" w:val="nil"/>
+                <w:right w:space="0" w:sz="0" w:val="nil"/>
+                <w:between w:space="0" w:sz="0" w:val="nil"/>
+              </w:pBdr>
+              <w:shd w:fill="auto" w:val="clear"/>
+              <w:spacing w:after="0" w:before="0" w:line="240" w:lineRule="auto"/>
+              <w:ind w:left="720" w:right="0" w:hanging="360"/>
+              <w:jc w:val="left"/>
+              <w:rPr>
+                <w:rFonts w:ascii="Times New Roman" w:cs="Times New Roman" w:eastAsia="Times New Roman" w:hAnsi="Times New Roman"/>
+                <w:b w:val="0"/>
+                <w:bCs w:val="0"/>
+                <w:i w:val="0"/>
+                <w:iCs w:val="0"/>
+                <w:smallCaps w:val="0"/>
+                <w:strike w:val="0"/>
+                <w:color w:val="000000"/>
+                <w:sz w:val="24"/>
+                <w:szCs w:val="24"/>
+                <w:u w:val="none"/>
+                <w:shd w:fill="auto" w:val="clear"/>
+                <w:vertAlign w:val="baseline"/>
+              </w:rPr>
+            </w:pPr>
+            <w:r>
+              <w:rPr>
+                <w:rtl w:val="0"/>
+              </w:rPr>
+              <w:t xml:space="preserve">8)Slanje newsletter za nove dostupne proizvode</w:t>
+            </w:r>
+            <w:r>
+              <w:rPr>
+                <w:rtl w:val="0"/>
+              </w:rPr>
+            </w:r>
+          </w:p>
+        </w:tc>
+        <w:tc>
+          <w:tcPr>
+            <w:vAlign w:val="center"/>
+          </w:tcPr>
+          <w:p>
+            <w:pPr>
+              <w:jc w:val="left"/>
+              <w:rPr/>
+            </w:pPr>
+            <w:r>
+              <w:rPr>
+                <w:rtl w:val="0"/>
+              </w:rPr>
+              <w:t xml:space="preserve">Prima newsletter</w:t>
+            </w:r>
+          </w:p>
+        </w:tc>
+      </w:tr>
     </w:tbl>
+    <w:p>
+      <w:pPr>
+        <w:ind w:left="360" w:firstLine="0"/>
+        <w:rPr/>
+      </w:pPr>
+      <w:r>
+        <w:rPr>
+          <w:rtl w:val="0"/>
+        </w:rPr>
+      </w:r>
+    </w:p>
+    <w:p>
+      <w:pPr>
+        <w:ind w:left="360" w:firstLine="0"/>
+        <w:rPr/>
+      </w:pPr>
+      <w:r>
+        <w:rPr>
+          <w:rtl w:val="0"/>
+        </w:rPr>
+      </w:r>
+    </w:p>
+    <w:p>
+      <w:pPr>
+        <w:ind w:left="360" w:firstLine="0"/>
+        <w:rPr/>
+      </w:pPr>
+      <w:r>
+        <w:rPr>
+          <w:rtl w:val="0"/>
+        </w:rPr>
+      </w:r>
+    </w:p>
+    <w:p>
+      <w:pPr>
+        <w:ind w:left="360" w:firstLine="0"/>
+        <w:rPr/>
+      </w:pPr>
+      <w:r>
+        <w:rPr>
+          <w:rtl w:val="0"/>
+        </w:rPr>
+      </w:r>
+    </w:p>
+    <w:p>
+      <w:pPr>
+        <w:ind w:left="360" w:firstLine="0"/>
+        <w:rPr/>
+      </w:pPr>
+      <w:r>
+        <w:rPr>
+          <w:rtl w:val="0"/>
+        </w:rPr>
+      </w:r>
+    </w:p>
+    <w:p>
+      <w:pPr>
+        <w:ind w:left="360" w:firstLine="0"/>
+        <w:rPr/>
+      </w:pPr>
+      <w:r>
+        <w:rPr>
+          <w:rtl w:val="0"/>
+        </w:rPr>
+      </w:r>
+    </w:p>
+    <w:p>
+      <w:pPr>
+        <w:ind w:left="360" w:firstLine="0"/>
+        <w:rPr/>
+      </w:pPr>
+      <w:r>
+        <w:rPr>
+          <w:rtl w:val="0"/>
+        </w:rPr>
+      </w:r>
+    </w:p>
+    <w:p>
+      <w:pPr>
+        <w:ind w:left="360" w:firstLine="0"/>
+        <w:rPr/>
+      </w:pPr>
+      <w:r>
+        <w:rPr>
+          <w:rtl w:val="0"/>
+        </w:rPr>
+      </w:r>
+    </w:p>
+    <w:p>
+      <w:pPr>
+        <w:ind w:left="360" w:firstLine="0"/>
+        <w:rPr/>
+      </w:pPr>
+      <w:r>
+        <w:rPr>
+          <w:rtl w:val="0"/>
+        </w:rPr>
+      </w:r>
+    </w:p>
     <w:p>
       <w:pPr>
         <w:ind w:left="360" w:firstLine="0"/>
@@ -3429,7 +3617,7 @@
               <w:rPr>
                 <w:rtl w:val="0"/>
               </w:rPr>
-              <w:t xml:space="preserve">3) Upravljanje terminima i rasporedom</w:t>
+              <w:t xml:space="preserve">3) Rezervacija i otkazivanje termina</w:t>
             </w:r>
             <w:r>
               <w:rPr>
@@ -3752,10 +3940,57 @@
             </w:pPr>
             <w:r>
               <w:rPr>
-                <w:color w:val="000000"/>
                 <w:rtl w:val="0"/>
               </w:rPr>
-              <w:t xml:space="preserve">2) Upravljanje uslugama i proizvoda       salona</w:t>
+              <w:t xml:space="preserve">1) Registracija i prijava korisnika</w:t>
+            </w:r>
+            <w:r>
+              <w:rPr>
+                <w:rtl w:val="0"/>
+              </w:rPr>
+            </w:r>
+          </w:p>
+        </w:tc>
+        <w:tc>
+          <w:tcPr>
+            <w:vAlign w:val="center"/>
+          </w:tcPr>
+          <w:p>
+            <w:pPr>
+              <w:jc w:val="left"/>
+              <w:rPr/>
+            </w:pPr>
+            <w:r>
+              <w:rPr>
+                <w:rtl w:val="0"/>
+              </w:rPr>
+              <w:t xml:space="preserve">Unos podataka za svrhu registracije uposlenika</w:t>
+            </w:r>
+          </w:p>
+        </w:tc>
+      </w:tr>
+      <w:tr>
+        <w:trPr>
+          <w:cantSplit w:val="0"/>
+          <w:trHeight w:val="620" w:hRule="atLeast"/>
+          <w:tblHeader w:val="0"/>
+        </w:trPr>
+        <w:tc>
+          <w:tcPr>
+            <w:vAlign w:val="center"/>
+          </w:tcPr>
+          <w:p>
+            <w:pPr>
+              <w:jc w:val="left"/>
+              <w:rPr>
+                <w:color w:val="808080"/>
+              </w:rPr>
+            </w:pPr>
+            <w:r>
+              <w:rPr>
+                <w:rtl w:val="0"/>
+              </w:rPr>
+              <w:t xml:space="preserve">2) Upravljanje uslugama, proizvodima i terminima salona</w:t>
             </w:r>
             <w:r>
               <w:rPr>
@@ -3795,20 +4030,13 @@
           <w:p>
             <w:pPr>
               <w:jc w:val="left"/>
-              <w:rPr>
-                <w:color w:val="808080"/>
-              </w:rPr>
+              <w:rPr/>
             </w:pPr>
             <w:r>
               <w:rPr>
                 <w:rtl w:val="0"/>
               </w:rPr>
-              <w:t xml:space="preserve">3) Upravljanje terminima i rasporedom</w:t>
-            </w:r>
-            <w:r>
-              <w:rPr>
-                <w:rtl w:val="0"/>
-              </w:rPr>
+              <w:t xml:space="preserve">4) Pregled proizvoda i usluga</w:t>
             </w:r>
           </w:p>
         </w:tc>
@@ -3825,48 +4053,7 @@
               <w:rPr>
                 <w:rtl w:val="0"/>
               </w:rPr>
-              <w:t xml:space="preserve">Pregled svih dostupnih/rezervisanih termina svih zaposlenika, te mogućnost izmjene</w:t>
-            </w:r>
-          </w:p>
-        </w:tc>
-      </w:tr>
-      <w:tr>
-        <w:trPr>
-          <w:cantSplit w:val="0"/>
-          <w:trHeight w:val="620" w:hRule="atLeast"/>
-          <w:tblHeader w:val="0"/>
-        </w:trPr>
-        <w:tc>
-          <w:tcPr>
-            <w:vAlign w:val="center"/>
-          </w:tcPr>
-          <w:p>
-            <w:pPr>
-              <w:jc w:val="left"/>
-              <w:rPr/>
-            </w:pPr>
-            <w:r>
-              <w:rPr>
-                <w:rtl w:val="0"/>
-              </w:rPr>
-              <w:t xml:space="preserve">8) Integracija sa mapom lokacija salona</w:t>
-            </w:r>
-          </w:p>
-        </w:tc>
-        <w:tc>
-          <w:tcPr>
-            <w:vAlign w:val="center"/>
-          </w:tcPr>
-          <w:p>
-            <w:pPr>
-              <w:jc w:val="left"/>
-              <w:rPr/>
-            </w:pPr>
-            <w:r>
-              <w:rPr>
-                <w:rtl w:val="0"/>
-              </w:rPr>
-              <w:t xml:space="preserve">Dodaje i održava lokaciju salona</w:t>
+              <w:t xml:space="preserve">Pregled svih dostupnih/rezervisanih termina svih zaposlenika, svih proizvoda i usluga, te mogućnost izmjene</w:t>
             </w:r>
           </w:p>
         </w:tc>
@@ -3898,238 +4085,6 @@
         </w:rPr>
       </w:r>
     </w:p>
-    <w:p>
-      <w:pPr>
-        <w:numPr>
-          <w:ilvl w:val="0"/>
-          <w:numId w:val="7"/>
-        </w:numPr>
-        <w:ind w:left="720" w:hanging="360"/>
-        <w:rPr>
-          <w:b w:val="1"/>
-          <w:bCs w:val="1"/>
-        </w:rPr>
-      </w:pPr>
-      <w:r>
-        <w:rPr>
-          <w:b w:val="1"/>
-          <w:bCs w:val="1"/>
-          <w:rtl w:val="0"/>
-        </w:rPr>
-        <w:t xml:space="preserve">Naziv aktera: Dostavljač</w:t>
-      </w:r>
-    </w:p>
-    <w:p>
-      <w:pPr>
-        <w:ind w:left="720" w:firstLine="0"/>
-        <w:rPr>
-          <w:b w:val="1"/>
-          <w:bCs w:val="1"/>
-        </w:rPr>
-      </w:pPr>
-      <w:r>
-        <w:rPr>
-          <w:rtl w:val="0"/>
-        </w:rPr>
-      </w:r>
-    </w:p>
-    <w:p>
-      <w:pPr>
-        <w:ind w:left="720" w:firstLine="0"/>
-        <w:rPr/>
-      </w:pPr>
-      <w:r>
-        <w:rPr>
-          <w:b w:val="1"/>
-          <w:bCs w:val="1"/>
-          <w:rtl w:val="0"/>
-        </w:rPr>
-        <w:t xml:space="preserve">Vrsta aktera: </w:t>
-      </w:r>
-      <w:r>
-        <w:rPr>
-          <w:rtl w:val="0"/>
-        </w:rPr>
-        <w:t xml:space="preserve">Zaposlenik sistema</w:t>
-      </w:r>
-    </w:p>
-    <w:p>
-      <w:pPr>
-        <w:ind w:left="720" w:firstLine="0"/>
-        <w:rPr>
-          <w:b w:val="1"/>
-          <w:bCs w:val="1"/>
-        </w:rPr>
-      </w:pPr>
-      <w:r>
-        <w:rPr>
-          <w:rtl w:val="0"/>
-        </w:rPr>
-      </w:r>
-    </w:p>
-    <w:p>
-      <w:pPr>
-        <w:ind w:left="720" w:firstLine="0"/>
-        <w:rPr/>
-      </w:pPr>
-      <w:r>
-        <w:rPr>
-          <w:b w:val="1"/>
-          <w:bCs w:val="1"/>
-          <w:rtl w:val="0"/>
-        </w:rPr>
-        <w:t xml:space="preserve">Funkcionalnosti u kojima akter učestvuje: </w:t>
-      </w:r>
-      <w:r>
-        <w:rPr>
-          <w:rtl w:val="0"/>
-        </w:rPr>
-      </w:r>
-    </w:p>
-    <w:p>
-      <w:pPr>
-        <w:ind w:left="720" w:firstLine="0"/>
-        <w:rPr/>
-      </w:pPr>
-      <w:r>
-        <w:rPr>
-          <w:rtl w:val="0"/>
-        </w:rPr>
-      </w:r>
-    </w:p>
-    <w:p>
-      <w:pPr>
-        <w:ind w:left="360" w:firstLine="0"/>
-        <w:rPr/>
-      </w:pPr>
-      <w:r>
-        <w:rPr>
-          <w:rtl w:val="0"/>
-        </w:rPr>
-      </w:r>
-    </w:p>
-    <w:tbl>
-      <w:tblPr>
-        <w:tblStyle w:val="Table4"/>
-        <w:tblW w:w="8550.0" w:type="dxa"/>
-        <w:jc w:val="left"/>
-        <w:tblInd w:w="715.0" w:type="dxa"/>
-        <w:tblBorders>
-          <w:top w:color="000000" w:space="0" w:sz="4" w:val="single"/>
-          <w:left w:color="000000" w:space="0" w:sz="4" w:val="single"/>
-          <w:bottom w:color="000000" w:space="0" w:sz="4" w:val="single"/>
-          <w:right w:color="000000" w:space="0" w:sz="4" w:val="single"/>
-          <w:insideH w:color="000000" w:space="0" w:sz="4" w:val="single"/>
-          <w:insideV w:color="000000" w:space="0" w:sz="4" w:val="single"/>
-        </w:tblBorders>
-        <w:tblLayout w:type="fixed"/>
-        <w:tblLook w:val="0400"/>
-      </w:tblPr>
-      <w:tblGrid>
-        <w:gridCol w:w="4500"/>
-        <w:gridCol w:w="4050"/>
-        <w:tblGridChange w:id="0">
-          <w:tblGrid>
-            <w:gridCol w:w="4500"/>
-            <w:gridCol w:w="4050"/>
-          </w:tblGrid>
-        </w:tblGridChange>
-      </w:tblGrid>
-      <w:tr>
-        <w:trPr>
-          <w:cantSplit w:val="0"/>
-          <w:trHeight w:val="485" w:hRule="atLeast"/>
-          <w:tblHeader w:val="0"/>
-        </w:trPr>
-        <w:tc>
-          <w:tcPr>
-            <w:shd w:fill="b4c6e7" w:val="clear"/>
-            <w:vAlign w:val="center"/>
-          </w:tcPr>
-          <w:p>
-            <w:pPr>
-              <w:jc w:val="left"/>
-              <w:rPr>
-                <w:b w:val="1"/>
-                <w:bCs w:val="1"/>
-              </w:rPr>
-            </w:pPr>
-            <w:r>
-              <w:rPr>
-                <w:b w:val="1"/>
-                <w:bCs w:val="1"/>
-                <w:rtl w:val="0"/>
-              </w:rPr>
-              <w:t xml:space="preserve">Funkcionalnost sistema</w:t>
-            </w:r>
-          </w:p>
-        </w:tc>
-        <w:tc>
-          <w:tcPr>
-            <w:shd w:fill="b4c6e7" w:val="clear"/>
-            <w:vAlign w:val="center"/>
-          </w:tcPr>
-          <w:p>
-            <w:pPr>
-              <w:jc w:val="left"/>
-              <w:rPr>
-                <w:b w:val="1"/>
-                <w:bCs w:val="1"/>
-              </w:rPr>
-            </w:pPr>
-            <w:r>
-              <w:rPr>
-                <w:b w:val="1"/>
-                <w:bCs w:val="1"/>
-                <w:rtl w:val="0"/>
-              </w:rPr>
-              <w:t xml:space="preserve">Način učešća</w:t>
-            </w:r>
-          </w:p>
-        </w:tc>
-      </w:tr>
-      <w:tr>
-        <w:trPr>
-          <w:cantSplit w:val="0"/>
-          <w:trHeight w:val="656" w:hRule="atLeast"/>
-          <w:tblHeader w:val="0"/>
-        </w:trPr>
-        <w:tc>
-          <w:tcPr>
-            <w:vAlign w:val="center"/>
-          </w:tcPr>
-          <w:p>
-            <w:pPr>
-              <w:jc w:val="left"/>
-              <w:rPr/>
-            </w:pPr>
-            <w:r>
-              <w:rPr>
-                <w:rtl w:val="0"/>
-              </w:rPr>
-              <w:t xml:space="preserve">7) Slanje potvrde rezervacije putem emaila</w:t>
-            </w:r>
-          </w:p>
-        </w:tc>
-        <w:tc>
-          <w:tcPr>
-            <w:vAlign w:val="center"/>
-          </w:tcPr>
-          <w:p>
-            <w:pPr>
-              <w:jc w:val="left"/>
-              <w:rPr/>
-            </w:pPr>
-            <w:r>
-              <w:rPr>
-                <w:rtl w:val="0"/>
-              </w:rPr>
-              <w:t xml:space="preserve">Prima email o pošiljci što treba dostaviti</w:t>
-            </w:r>
-          </w:p>
-        </w:tc>
-      </w:tr>
-    </w:tbl>
     <w:p>
       <w:pPr>
         <w:ind w:left="360" w:firstLine="0"/>
@@ -5688,22 +5643,6 @@
       </w:tblCellMar>
     </w:tblPr>
   </w:style>
-  <w:style w:type="table" w:styleId="Table4">
-    <w:basedOn w:val="TableNormal"/>
-    <w:pPr>
-      <w:spacing w:after="0" w:line="240" w:lineRule="auto"/>
-    </w:pPr>
-    <w:tblPr>
-      <w:tblStyleRowBandSize w:val="1"/>
-      <w:tblStyleColBandSize w:val="1"/>
-      <w:tblCellMar>
-        <w:top w:w="0.0" w:type="dxa"/>
-        <w:left w:w="108.0" w:type="dxa"/>
-        <w:bottom w:w="0.0" w:type="dxa"/>
-        <w:right w:w="108.0" w:type="dxa"/>
-      </w:tblCellMar>
-    </w:tblPr>
-  </w:style>
 </w:styles>
 </file>
 

</xml_diff>